<commit_message>
Add co-author Thilini Bakmeedeniya and institutional emails to paper header
</commit_message>
<xml_diff>
--- a/paper/ICACT2026_GreenGate.docx
+++ b/paper/ICACT2026_GreenGate.docx
@@ -16,48 +16,221 @@
         <w:t xml:space="preserve">What Counts as Saved? Measured-Energy Accounting for Confidence-Aware LLM Cascades</w:t>
       </w:r>
     </w:p>
-    <w:p>
-      <w:pPr>
-        <w:spacing w:after="20"/>
-        <w:jc w:val="center"/>
-      </w:pPr>
-      <w:r>
-        <w:rPr>
-          <w:rFonts w:ascii="Times New Roman" w:cs="Times New Roman" w:eastAsia="Times New Roman" w:hAnsi="Times New Roman"/>
-          <w:sz w:val="22"/>
-          <w:szCs w:val="22"/>
-        </w:rPr>
-        <w:t xml:space="preserve">Tharusha Rasath Hemachandra</w:t>
-      </w:r>
-    </w:p>
-    <w:p>
-      <w:pPr>
-        <w:spacing w:after="20"/>
-        <w:jc w:val="center"/>
-      </w:pPr>
-      <w:r>
-        <w:rPr>
-          <w:rFonts w:ascii="Times New Roman" w:cs="Times New Roman" w:eastAsia="Times New Roman" w:hAnsi="Times New Roman"/>
-          <w:i/>
-          <w:iCs/>
-          <w:sz w:val="20"/>
-          <w:szCs w:val="20"/>
-        </w:rPr>
-        <w:t xml:space="preserve">Faculty of Computing, NSBM Green University, Homagama, Sri Lanka</w:t>
-      </w:r>
-    </w:p>
-    <w:p>
-      <w:pPr>
-        <w:spacing w:after="240"/>
-        <w:jc w:val="center"/>
-      </w:pPr>
-      <w:r>
-        <w:rPr>
-          <w:rFonts w:ascii="Times New Roman" w:cs="Times New Roman" w:eastAsia="Times New Roman" w:hAnsi="Times New Roman"/>
-          <w:sz w:val="20"/>
-          <w:szCs w:val="20"/>
-        </w:rPr>
-        <w:t xml:space="preserve">tharusharasathml@gmail.com</w:t>
+    <w:tbl>
+      <w:tblPr>
+        <w:tblW w:type="dxa" w:w="9600"/>
+        <w:tblBorders>
+          <w:top w:val="none" w:color="FFFFFF" w:sz="0"/>
+          <w:left w:val="none" w:color="FFFFFF" w:sz="0"/>
+          <w:bottom w:val="none" w:color="FFFFFF" w:sz="0"/>
+          <w:right w:val="none" w:color="FFFFFF" w:sz="0"/>
+          <w:insideH w:val="none" w:color="FFFFFF" w:sz="0"/>
+          <w:insideV w:val="none" w:color="FFFFFF" w:sz="0"/>
+        </w:tblBorders>
+      </w:tblPr>
+      <w:tblGrid>
+        <w:gridCol w:w="4800"/>
+        <w:gridCol w:w="4800"/>
+      </w:tblGrid>
+      <w:tr>
+        <w:tc>
+          <w:tcPr>
+            <w:tcW w:type="dxa" w:w="4800"/>
+            <w:tcBorders>
+              <w:top w:val="none" w:color="FFFFFF" w:sz="0"/>
+              <w:left w:val="none" w:color="FFFFFF" w:sz="0"/>
+              <w:bottom w:val="none" w:color="FFFFFF" w:sz="0"/>
+              <w:right w:val="none" w:color="FFFFFF" w:sz="0"/>
+            </w:tcBorders>
+            <w:tcMar>
+              <w:top w:type="dxa" w:w="0"/>
+              <w:left w:type="dxa" w:w="100"/>
+              <w:bottom w:type="dxa" w:w="0"/>
+              <w:right w:type="dxa" w:w="100"/>
+            </w:tcMar>
+          </w:tcPr>
+          <w:p>
+            <w:pPr>
+              <w:spacing w:after="20"/>
+              <w:jc w:val="center"/>
+            </w:pPr>
+            <w:r>
+              <w:rPr>
+                <w:rFonts w:ascii="Times New Roman" w:cs="Times New Roman" w:eastAsia="Times New Roman" w:hAnsi="Times New Roman"/>
+                <w:sz w:val="22"/>
+                <w:szCs w:val="22"/>
+              </w:rPr>
+              <w:t xml:space="preserve">Tharusha Rasath Hemachandra</w:t>
+            </w:r>
+          </w:p>
+          <w:p>
+            <w:pPr>
+              <w:spacing w:after="20"/>
+              <w:jc w:val="center"/>
+            </w:pPr>
+            <w:r>
+              <w:rPr>
+                <w:rFonts w:ascii="Times New Roman" w:cs="Times New Roman" w:eastAsia="Times New Roman" w:hAnsi="Times New Roman"/>
+                <w:i/>
+                <w:iCs/>
+                <w:sz w:val="20"/>
+                <w:szCs w:val="20"/>
+              </w:rPr>
+              <w:t xml:space="preserve">Faculty of Computing</w:t>
+            </w:r>
+          </w:p>
+          <w:p>
+            <w:pPr>
+              <w:spacing w:after="20"/>
+              <w:jc w:val="center"/>
+            </w:pPr>
+            <w:r>
+              <w:rPr>
+                <w:rFonts w:ascii="Times New Roman" w:cs="Times New Roman" w:eastAsia="Times New Roman" w:hAnsi="Times New Roman"/>
+                <w:i/>
+                <w:iCs/>
+                <w:sz w:val="20"/>
+                <w:szCs w:val="20"/>
+              </w:rPr>
+              <w:t xml:space="preserve">NSBM Green University</w:t>
+            </w:r>
+          </w:p>
+          <w:p>
+            <w:pPr>
+              <w:spacing w:after="20"/>
+              <w:jc w:val="center"/>
+            </w:pPr>
+            <w:r>
+              <w:rPr>
+                <w:rFonts w:ascii="Times New Roman" w:cs="Times New Roman" w:eastAsia="Times New Roman" w:hAnsi="Times New Roman"/>
+                <w:i/>
+                <w:iCs/>
+                <w:sz w:val="20"/>
+                <w:szCs w:val="20"/>
+              </w:rPr>
+              <w:t xml:space="preserve">Homagama, Sri Lanka</w:t>
+            </w:r>
+          </w:p>
+          <w:p>
+            <w:pPr>
+              <w:spacing w:after="0"/>
+              <w:jc w:val="center"/>
+            </w:pPr>
+            <w:r>
+              <w:rPr>
+                <w:rFonts w:ascii="Times New Roman" w:cs="Times New Roman" w:eastAsia="Times New Roman" w:hAnsi="Times New Roman"/>
+                <w:sz w:val="20"/>
+                <w:szCs w:val="20"/>
+              </w:rPr>
+              <w:t xml:space="preserve">ptrhemachandra@students.nsbm.ac.lk</w:t>
+            </w:r>
+          </w:p>
+        </w:tc>
+        <w:tc>
+          <w:tcPr>
+            <w:tcW w:type="dxa" w:w="4800"/>
+            <w:tcBorders>
+              <w:top w:val="none" w:color="FFFFFF" w:sz="0"/>
+              <w:left w:val="none" w:color="FFFFFF" w:sz="0"/>
+              <w:bottom w:val="none" w:color="FFFFFF" w:sz="0"/>
+              <w:right w:val="none" w:color="FFFFFF" w:sz="0"/>
+            </w:tcBorders>
+            <w:tcMar>
+              <w:top w:type="dxa" w:w="0"/>
+              <w:left w:type="dxa" w:w="100"/>
+              <w:bottom w:type="dxa" w:w="0"/>
+              <w:right w:type="dxa" w:w="100"/>
+            </w:tcMar>
+          </w:tcPr>
+          <w:p>
+            <w:pPr>
+              <w:spacing w:after="20"/>
+              <w:jc w:val="center"/>
+            </w:pPr>
+            <w:r>
+              <w:rPr>
+                <w:rFonts w:ascii="Times New Roman" w:cs="Times New Roman" w:eastAsia="Times New Roman" w:hAnsi="Times New Roman"/>
+                <w:sz w:val="22"/>
+                <w:szCs w:val="22"/>
+              </w:rPr>
+              <w:t xml:space="preserve">Thilini Bakmeedeniya</w:t>
+            </w:r>
+          </w:p>
+          <w:p>
+            <w:pPr>
+              <w:spacing w:after="20"/>
+              <w:jc w:val="center"/>
+            </w:pPr>
+            <w:r>
+              <w:rPr>
+                <w:rFonts w:ascii="Times New Roman" w:cs="Times New Roman" w:eastAsia="Times New Roman" w:hAnsi="Times New Roman"/>
+                <w:i/>
+                <w:iCs/>
+                <w:sz w:val="20"/>
+                <w:szCs w:val="20"/>
+              </w:rPr>
+              <w:t xml:space="preserve">Faculty of Computing</w:t>
+            </w:r>
+          </w:p>
+          <w:p>
+            <w:pPr>
+              <w:spacing w:after="20"/>
+              <w:jc w:val="center"/>
+            </w:pPr>
+            <w:r>
+              <w:rPr>
+                <w:rFonts w:ascii="Times New Roman" w:cs="Times New Roman" w:eastAsia="Times New Roman" w:hAnsi="Times New Roman"/>
+                <w:i/>
+                <w:iCs/>
+                <w:sz w:val="20"/>
+                <w:szCs w:val="20"/>
+              </w:rPr>
+              <w:t xml:space="preserve">NSBM Green University</w:t>
+            </w:r>
+          </w:p>
+          <w:p>
+            <w:pPr>
+              <w:spacing w:after="20"/>
+              <w:jc w:val="center"/>
+            </w:pPr>
+            <w:r>
+              <w:rPr>
+                <w:rFonts w:ascii="Times New Roman" w:cs="Times New Roman" w:eastAsia="Times New Roman" w:hAnsi="Times New Roman"/>
+                <w:i/>
+                <w:iCs/>
+                <w:sz w:val="20"/>
+                <w:szCs w:val="20"/>
+              </w:rPr>
+              <w:t xml:space="preserve">Homagama, Sri Lanka</w:t>
+            </w:r>
+          </w:p>
+          <w:p>
+            <w:pPr>
+              <w:spacing w:after="0"/>
+              <w:jc w:val="center"/>
+            </w:pPr>
+            <w:r>
+              <w:rPr>
+                <w:rFonts w:ascii="Times New Roman" w:cs="Times New Roman" w:eastAsia="Times New Roman" w:hAnsi="Times New Roman"/>
+                <w:sz w:val="20"/>
+                <w:szCs w:val="20"/>
+              </w:rPr>
+              <w:t xml:space="preserve">thilini.b@nsbm.ac.lk</w:t>
+            </w:r>
+          </w:p>
+        </w:tc>
+      </w:tr>
+    </w:tbl>
+    <w:p>
+      <w:pPr>
+        <w:spacing w:after="200"/>
+      </w:pPr>
+      <w:r>
+        <w:rPr>
+          <w:sz w:val="10"/>
+          <w:szCs w:val="10"/>
+        </w:rPr>
+        <w:t xml:space="preserve"> </w:t>
       </w:r>
     </w:p>
     <w:p>

</xml_diff>

<commit_message>
Match IEEE conference template styling: 17pt bold title, single-line author block, separate Abstract heading, Index Terms, bold section headings, IEEE margins and column spacing
</commit_message>
<xml_diff>
--- a/paper/ICACT2026_GreenGate.docx
+++ b/paper/ICACT2026_GreenGate.docx
@@ -4,240 +4,69 @@
   <w:body>
     <w:p>
       <w:pPr>
-        <w:spacing w:after="120"/>
+        <w:spacing w:after="200"/>
         <w:jc w:val="center"/>
       </w:pPr>
       <w:r>
         <w:rPr>
           <w:rFonts w:ascii="Times New Roman" w:cs="Times New Roman" w:eastAsia="Times New Roman" w:hAnsi="Times New Roman"/>
-          <w:sz w:val="48"/>
-          <w:szCs w:val="48"/>
+          <w:b/>
+          <w:bCs/>
+          <w:sz w:val="34"/>
+          <w:szCs w:val="34"/>
         </w:rPr>
         <w:t xml:space="preserve">What Counts as Saved? Measured-Energy Accounting for Confidence-Aware LLM Cascades</w:t>
       </w:r>
     </w:p>
-    <w:tbl>
-      <w:tblPr>
-        <w:tblW w:type="dxa" w:w="9600"/>
-        <w:tblBorders>
-          <w:top w:val="none" w:color="FFFFFF" w:sz="0"/>
-          <w:left w:val="none" w:color="FFFFFF" w:sz="0"/>
-          <w:bottom w:val="none" w:color="FFFFFF" w:sz="0"/>
-          <w:right w:val="none" w:color="FFFFFF" w:sz="0"/>
-          <w:insideH w:val="none" w:color="FFFFFF" w:sz="0"/>
-          <w:insideV w:val="none" w:color="FFFFFF" w:sz="0"/>
-        </w:tblBorders>
-      </w:tblPr>
-      <w:tblGrid>
-        <w:gridCol w:w="4800"/>
-        <w:gridCol w:w="4800"/>
-      </w:tblGrid>
-      <w:tr>
-        <w:tc>
-          <w:tcPr>
-            <w:tcW w:type="dxa" w:w="4800"/>
-            <w:tcBorders>
-              <w:top w:val="none" w:color="FFFFFF" w:sz="0"/>
-              <w:left w:val="none" w:color="FFFFFF" w:sz="0"/>
-              <w:bottom w:val="none" w:color="FFFFFF" w:sz="0"/>
-              <w:right w:val="none" w:color="FFFFFF" w:sz="0"/>
-            </w:tcBorders>
-            <w:tcMar>
-              <w:top w:type="dxa" w:w="0"/>
-              <w:left w:type="dxa" w:w="100"/>
-              <w:bottom w:type="dxa" w:w="0"/>
-              <w:right w:type="dxa" w:w="100"/>
-            </w:tcMar>
-          </w:tcPr>
-          <w:p>
-            <w:pPr>
-              <w:spacing w:after="20"/>
-              <w:jc w:val="center"/>
-            </w:pPr>
-            <w:r>
-              <w:rPr>
-                <w:rFonts w:ascii="Times New Roman" w:cs="Times New Roman" w:eastAsia="Times New Roman" w:hAnsi="Times New Roman"/>
-                <w:sz w:val="22"/>
-                <w:szCs w:val="22"/>
-              </w:rPr>
-              <w:t xml:space="preserve">Tharusha Rasath Hemachandra</w:t>
-            </w:r>
-          </w:p>
-          <w:p>
-            <w:pPr>
-              <w:spacing w:after="20"/>
-              <w:jc w:val="center"/>
-            </w:pPr>
-            <w:r>
-              <w:rPr>
-                <w:rFonts w:ascii="Times New Roman" w:cs="Times New Roman" w:eastAsia="Times New Roman" w:hAnsi="Times New Roman"/>
-                <w:i/>
-                <w:iCs/>
-                <w:sz w:val="20"/>
-                <w:szCs w:val="20"/>
-              </w:rPr>
-              <w:t xml:space="preserve">Faculty of Computing</w:t>
-            </w:r>
-          </w:p>
-          <w:p>
-            <w:pPr>
-              <w:spacing w:after="20"/>
-              <w:jc w:val="center"/>
-            </w:pPr>
-            <w:r>
-              <w:rPr>
-                <w:rFonts w:ascii="Times New Roman" w:cs="Times New Roman" w:eastAsia="Times New Roman" w:hAnsi="Times New Roman"/>
-                <w:i/>
-                <w:iCs/>
-                <w:sz w:val="20"/>
-                <w:szCs w:val="20"/>
-              </w:rPr>
-              <w:t xml:space="preserve">NSBM Green University</w:t>
-            </w:r>
-          </w:p>
-          <w:p>
-            <w:pPr>
-              <w:spacing w:after="20"/>
-              <w:jc w:val="center"/>
-            </w:pPr>
-            <w:r>
-              <w:rPr>
-                <w:rFonts w:ascii="Times New Roman" w:cs="Times New Roman" w:eastAsia="Times New Roman" w:hAnsi="Times New Roman"/>
-                <w:i/>
-                <w:iCs/>
-                <w:sz w:val="20"/>
-                <w:szCs w:val="20"/>
-              </w:rPr>
-              <w:t xml:space="preserve">Homagama, Sri Lanka</w:t>
-            </w:r>
-          </w:p>
-          <w:p>
-            <w:pPr>
-              <w:spacing w:after="0"/>
-              <w:jc w:val="center"/>
-            </w:pPr>
-            <w:r>
-              <w:rPr>
-                <w:rFonts w:ascii="Times New Roman" w:cs="Times New Roman" w:eastAsia="Times New Roman" w:hAnsi="Times New Roman"/>
-                <w:sz w:val="20"/>
-                <w:szCs w:val="20"/>
-              </w:rPr>
-              <w:t xml:space="preserve">ptrhemachandra@students.nsbm.ac.lk</w:t>
-            </w:r>
-          </w:p>
-        </w:tc>
-        <w:tc>
-          <w:tcPr>
-            <w:tcW w:type="dxa" w:w="4800"/>
-            <w:tcBorders>
-              <w:top w:val="none" w:color="FFFFFF" w:sz="0"/>
-              <w:left w:val="none" w:color="FFFFFF" w:sz="0"/>
-              <w:bottom w:val="none" w:color="FFFFFF" w:sz="0"/>
-              <w:right w:val="none" w:color="FFFFFF" w:sz="0"/>
-            </w:tcBorders>
-            <w:tcMar>
-              <w:top w:type="dxa" w:w="0"/>
-              <w:left w:type="dxa" w:w="100"/>
-              <w:bottom w:type="dxa" w:w="0"/>
-              <w:right w:type="dxa" w:w="100"/>
-            </w:tcMar>
-          </w:tcPr>
-          <w:p>
-            <w:pPr>
-              <w:spacing w:after="20"/>
-              <w:jc w:val="center"/>
-            </w:pPr>
-            <w:r>
-              <w:rPr>
-                <w:rFonts w:ascii="Times New Roman" w:cs="Times New Roman" w:eastAsia="Times New Roman" w:hAnsi="Times New Roman"/>
-                <w:sz w:val="22"/>
-                <w:szCs w:val="22"/>
-              </w:rPr>
-              <w:t xml:space="preserve">Thilini Bakmeedeniya</w:t>
-            </w:r>
-          </w:p>
-          <w:p>
-            <w:pPr>
-              <w:spacing w:after="20"/>
-              <w:jc w:val="center"/>
-            </w:pPr>
-            <w:r>
-              <w:rPr>
-                <w:rFonts w:ascii="Times New Roman" w:cs="Times New Roman" w:eastAsia="Times New Roman" w:hAnsi="Times New Roman"/>
-                <w:i/>
-                <w:iCs/>
-                <w:sz w:val="20"/>
-                <w:szCs w:val="20"/>
-              </w:rPr>
-              <w:t xml:space="preserve">Faculty of Computing</w:t>
-            </w:r>
-          </w:p>
-          <w:p>
-            <w:pPr>
-              <w:spacing w:after="20"/>
-              <w:jc w:val="center"/>
-            </w:pPr>
-            <w:r>
-              <w:rPr>
-                <w:rFonts w:ascii="Times New Roman" w:cs="Times New Roman" w:eastAsia="Times New Roman" w:hAnsi="Times New Roman"/>
-                <w:i/>
-                <w:iCs/>
-                <w:sz w:val="20"/>
-                <w:szCs w:val="20"/>
-              </w:rPr>
-              <w:t xml:space="preserve">NSBM Green University</w:t>
-            </w:r>
-          </w:p>
-          <w:p>
-            <w:pPr>
-              <w:spacing w:after="20"/>
-              <w:jc w:val="center"/>
-            </w:pPr>
-            <w:r>
-              <w:rPr>
-                <w:rFonts w:ascii="Times New Roman" w:cs="Times New Roman" w:eastAsia="Times New Roman" w:hAnsi="Times New Roman"/>
-                <w:i/>
-                <w:iCs/>
-                <w:sz w:val="20"/>
-                <w:szCs w:val="20"/>
-              </w:rPr>
-              <w:t xml:space="preserve">Homagama, Sri Lanka</w:t>
-            </w:r>
-          </w:p>
-          <w:p>
-            <w:pPr>
-              <w:spacing w:after="0"/>
-              <w:jc w:val="center"/>
-            </w:pPr>
-            <w:r>
-              <w:rPr>
-                <w:rFonts w:ascii="Times New Roman" w:cs="Times New Roman" w:eastAsia="Times New Roman" w:hAnsi="Times New Roman"/>
-                <w:sz w:val="20"/>
-                <w:szCs w:val="20"/>
-              </w:rPr>
-              <w:t xml:space="preserve">thilini.b@nsbm.ac.lk</w:t>
-            </w:r>
-          </w:p>
-        </w:tc>
-      </w:tr>
-    </w:tbl>
-    <w:p>
-      <w:pPr>
-        <w:spacing w:after="200"/>
-      </w:pPr>
-      <w:r>
-        <w:rPr>
-          <w:sz w:val="10"/>
-          <w:szCs w:val="10"/>
-        </w:rPr>
-        <w:t xml:space="preserve"> </w:t>
+    <w:p>
+      <w:pPr>
+        <w:spacing w:after="40"/>
+        <w:jc w:val="center"/>
+      </w:pPr>
+      <w:r>
+        <w:rPr>
+          <w:rFonts w:ascii="Times New Roman" w:cs="Times New Roman" w:eastAsia="Times New Roman" w:hAnsi="Times New Roman"/>
+          <w:sz w:val="22"/>
+          <w:szCs w:val="22"/>
+        </w:rPr>
+        <w:t xml:space="preserve">Tharusha Rasath Hemachandra, Thilini Bakmeedeniya</w:t>
+      </w:r>
+    </w:p>
+    <w:p>
+      <w:pPr>
+        <w:spacing w:after="40"/>
+        <w:jc w:val="center"/>
+      </w:pPr>
+      <w:r>
+        <w:rPr>
+          <w:rFonts w:ascii="Times New Roman" w:cs="Times New Roman" w:eastAsia="Times New Roman" w:hAnsi="Times New Roman"/>
+          <w:i/>
+          <w:iCs/>
+          <w:sz w:val="20"/>
+          <w:szCs w:val="20"/>
+        </w:rPr>
+        <w:t xml:space="preserve">Faculty of Computing, NSBM Green University, Homagama, Sri Lanka</w:t>
+      </w:r>
+    </w:p>
+    <w:p>
+      <w:pPr>
+        <w:spacing w:after="240"/>
+        <w:jc w:val="center"/>
+      </w:pPr>
+      <w:r>
+        <w:rPr>
+          <w:rFonts w:ascii="Times New Roman" w:cs="Times New Roman" w:eastAsia="Times New Roman" w:hAnsi="Times New Roman"/>
+          <w:sz w:val="18"/>
+          <w:szCs w:val="18"/>
+        </w:rPr>
+        <w:t xml:space="preserve">ptrhemachandra@students.nsbm.ac.lk, thilini.b@nsbm.ac.lk</w:t>
       </w:r>
     </w:p>
     <w:p>
       <w:pPr>
         <w:sectPr>
           <w:pgSz w:w="11906" w:h="16838" w:orient="portrait"/>
-          <w:pgMar w:top="1000" w:right="1000" w:bottom="1000" w:left="1000" w:header="708" w:footer="708" w:gutter="0"/>
+          <w:pgMar w:top="1080" w:right="900" w:bottom="1440" w:left="900" w:header="708" w:footer="708" w:gutter="0"/>
           <w:pgNumType/>
           <w:docGrid w:linePitch="360"/>
         </w:sectPr>
@@ -245,8 +74,7 @@
     </w:p>
     <w:p>
       <w:pPr>
-        <w:spacing w:after="100"/>
-        <w:jc w:val="both"/>
+        <w:spacing w:after="60"/>
       </w:pPr>
       <w:r>
         <w:rPr>
@@ -258,22 +86,12 @@
           <w:sz w:val="18"/>
           <w:szCs w:val="18"/>
         </w:rPr>
-        <w:t xml:space="preserve">Abstract—</w:t>
-      </w:r>
-      <w:r>
-        <w:rPr>
-          <w:rFonts w:ascii="Times New Roman" w:cs="Times New Roman" w:eastAsia="Times New Roman" w:hAnsi="Times New Roman"/>
-          <w:i/>
-          <w:iCs/>
-          <w:sz w:val="18"/>
-          <w:szCs w:val="18"/>
-        </w:rPr>
-        <w:t xml:space="preserve">Model cascading reduces the cost of large language model inference by answering easy queries with a small model and escalating only uncertain ones. When a query escalates, the small model has already run and its energy is spent, yet an escalated query can be charged either for both tiers or only for the tier that produced the returned answer. This paper measures what that choice is worth. We implement GreenGate, an open-source cascading middleware that meters GPU power at 100 ms intervals across all devices, uses temperature-scaled uncertainty as a training-free routing signal, and charges escalated queries for both tiers. Across 2,800 evaluated queries spanning open-ended user traffic, a structured benchmark and a visual question-answering workload, the two conventions diverge by 2.6 percentage points at 5 percent escalation and by 31.4 points at 60 percent, where charging only the answering tier reports a 23.3 percent reduction while full accounting shows an 8.0 percent increase over never cascading. Full accounting yields a break-even condition in which savings approximate the complement of the inter-tier energy ratio minus the escalation rate, which our measurements obey. Under this stricter accounting the cascade still reduces measured energy by 37.3 percent (95 percent CI 33.5 to 40.9) while retaining 95.9 percent of large-tier answer quality. A five-model study shows that routing-signal informativeness scales with small-model capability and identifies a capability floor below which cascading is strictly harmful, a regime that charging only the answering tier cannot express.</w:t>
-      </w:r>
-    </w:p>
-    <w:p>
-      <w:pPr>
-        <w:spacing w:after="160"/>
+        <w:t xml:space="preserve">Abstract</w:t>
+      </w:r>
+    </w:p>
+    <w:p>
+      <w:pPr>
+        <w:spacing w:after="120"/>
         <w:jc w:val="both"/>
       </w:pPr>
       <w:r>
@@ -286,16 +104,34 @@
           <w:sz w:val="18"/>
           <w:szCs w:val="18"/>
         </w:rPr>
-        <w:t xml:space="preserve">Keywords—</w:t>
-      </w:r>
-      <w:r>
-        <w:rPr>
-          <w:rFonts w:ascii="Times New Roman" w:cs="Times New Roman" w:eastAsia="Times New Roman" w:hAnsi="Times New Roman"/>
+        <w:t xml:space="preserve">Model cascading reduces the cost of large language model inference by answering easy queries with a small model and escalating only uncertain ones. When a query escalates, the small model has already run and its energy is spent, yet an escalated query can be charged either for both tiers or only for the tier that produced the returned answer. This paper measures what that choice is worth. We implement GreenGate, an open-source cascading middleware that meters GPU power at 100 ms intervals across all devices, uses temperature-scaled uncertainty as a training-free routing signal, and charges escalated queries for both tiers. Across 2,800 evaluated queries spanning open-ended user traffic, a structured benchmark and a visual question-answering workload, the two conventions diverge by 2.6 percentage points at 5 percent escalation and by 31.4 points at 60 percent, where charging only the answering tier reports a 23.3 percent reduction while full accounting shows an 8.0 percent increase over never cascading. Full accounting yields a break-even condition in which savings approximate the complement of the inter-tier energy ratio minus the escalation rate, which our measurements obey. Under this stricter accounting the cascade still reduces measured energy by 37.3 percent (95 percent CI 33.5 to 40.9) while retaining 95.9 percent of large-tier answer quality. A five-model study shows that routing-signal informativeness scales with small-model capability and identifies a capability floor below which cascading is strictly harmful, a regime that charging only the answering tier cannot express.</w:t>
+      </w:r>
+    </w:p>
+    <w:p>
+      <w:pPr>
+        <w:spacing w:after="160"/>
+        <w:jc w:val="both"/>
+      </w:pPr>
+      <w:r>
+        <w:rPr>
+          <w:rFonts w:ascii="Times New Roman" w:cs="Times New Roman" w:eastAsia="Times New Roman" w:hAnsi="Times New Roman"/>
+          <w:b/>
+          <w:bCs/>
           <w:i/>
           <w:iCs/>
           <w:sz w:val="18"/>
           <w:szCs w:val="18"/>
         </w:rPr>
+        <w:t xml:space="preserve">Index Terms—</w:t>
+      </w:r>
+      <w:r>
+        <w:rPr>
+          <w:rFonts w:ascii="Times New Roman" w:cs="Times New Roman" w:eastAsia="Times New Roman" w:hAnsi="Times New Roman"/>
+          <w:i/>
+          <w:iCs/>
+          <w:sz w:val="18"/>
+          <w:szCs w:val="18"/>
+        </w:rPr>
         <w:t xml:space="preserve">green AI, model cascading, carbon accounting, energy measurement, uncertainty estimation</w:t>
       </w:r>
     </w:p>
@@ -307,7 +143,8 @@
       <w:r>
         <w:rPr>
           <w:rFonts w:ascii="Times New Roman" w:cs="Times New Roman" w:eastAsia="Times New Roman" w:hAnsi="Times New Roman"/>
-          <w:caps/>
+          <w:b/>
+          <w:bCs/>
           <w:sz w:val="20"/>
           <w:szCs w:val="20"/>
         </w:rPr>
@@ -442,7 +279,8 @@
       <w:r>
         <w:rPr>
           <w:rFonts w:ascii="Times New Roman" w:cs="Times New Roman" w:eastAsia="Times New Roman" w:hAnsi="Times New Roman"/>
-          <w:caps/>
+          <w:b/>
+          <w:bCs/>
           <w:sz w:val="20"/>
           <w:szCs w:val="20"/>
         </w:rPr>
@@ -1609,7 +1447,8 @@
       <w:r>
         <w:rPr>
           <w:rFonts w:ascii="Times New Roman" w:cs="Times New Roman" w:eastAsia="Times New Roman" w:hAnsi="Times New Roman"/>
-          <w:caps/>
+          <w:b/>
+          <w:bCs/>
           <w:sz w:val="20"/>
           <w:szCs w:val="20"/>
         </w:rPr>
@@ -1623,6 +1462,8 @@
       <w:r>
         <w:rPr>
           <w:rFonts w:ascii="Times New Roman" w:cs="Times New Roman" w:eastAsia="Times New Roman" w:hAnsi="Times New Roman"/>
+          <w:b/>
+          <w:bCs/>
           <w:i/>
           <w:iCs/>
           <w:sz w:val="20"/>
@@ -1653,6 +1494,8 @@
       <w:r>
         <w:rPr>
           <w:rFonts w:ascii="Times New Roman" w:cs="Times New Roman" w:eastAsia="Times New Roman" w:hAnsi="Times New Roman"/>
+          <w:b/>
+          <w:bCs/>
           <w:i/>
           <w:iCs/>
           <w:sz w:val="20"/>
@@ -1683,6 +1526,8 @@
       <w:r>
         <w:rPr>
           <w:rFonts w:ascii="Times New Roman" w:cs="Times New Roman" w:eastAsia="Times New Roman" w:hAnsi="Times New Roman"/>
+          <w:b/>
+          <w:bCs/>
           <w:i/>
           <w:iCs/>
           <w:sz w:val="20"/>
@@ -1744,6 +1589,8 @@
       <w:r>
         <w:rPr>
           <w:rFonts w:ascii="Times New Roman" w:cs="Times New Roman" w:eastAsia="Times New Roman" w:hAnsi="Times New Roman"/>
+          <w:b/>
+          <w:bCs/>
           <w:i/>
           <w:iCs/>
           <w:sz w:val="20"/>
@@ -1834,6 +1681,8 @@
       <w:r>
         <w:rPr>
           <w:rFonts w:ascii="Times New Roman" w:cs="Times New Roman" w:eastAsia="Times New Roman" w:hAnsi="Times New Roman"/>
+          <w:b/>
+          <w:bCs/>
           <w:i/>
           <w:iCs/>
           <w:sz w:val="20"/>
@@ -1865,7 +1714,8 @@
       <w:r>
         <w:rPr>
           <w:rFonts w:ascii="Times New Roman" w:cs="Times New Roman" w:eastAsia="Times New Roman" w:hAnsi="Times New Roman"/>
-          <w:caps/>
+          <w:b/>
+          <w:bCs/>
           <w:sz w:val="20"/>
           <w:szCs w:val="20"/>
         </w:rPr>
@@ -1940,7 +1790,8 @@
       <w:r>
         <w:rPr>
           <w:rFonts w:ascii="Times New Roman" w:cs="Times New Roman" w:eastAsia="Times New Roman" w:hAnsi="Times New Roman"/>
-          <w:caps/>
+          <w:b/>
+          <w:bCs/>
           <w:sz w:val="20"/>
           <w:szCs w:val="20"/>
         </w:rPr>
@@ -1954,6 +1805,8 @@
       <w:r>
         <w:rPr>
           <w:rFonts w:ascii="Times New Roman" w:cs="Times New Roman" w:eastAsia="Times New Roman" w:hAnsi="Times New Roman"/>
+          <w:b/>
+          <w:bCs/>
           <w:i/>
           <w:iCs/>
           <w:sz w:val="20"/>
@@ -2835,6 +2688,8 @@
       <w:r>
         <w:rPr>
           <w:rFonts w:ascii="Times New Roman" w:cs="Times New Roman" w:eastAsia="Times New Roman" w:hAnsi="Times New Roman"/>
+          <w:b/>
+          <w:bCs/>
           <w:i/>
           <w:iCs/>
           <w:sz w:val="20"/>
@@ -4830,6 +4685,8 @@
       <w:r>
         <w:rPr>
           <w:rFonts w:ascii="Times New Roman" w:cs="Times New Roman" w:eastAsia="Times New Roman" w:hAnsi="Times New Roman"/>
+          <w:b/>
+          <w:bCs/>
           <w:i/>
           <w:iCs/>
           <w:sz w:val="20"/>
@@ -4860,6 +4717,8 @@
       <w:r>
         <w:rPr>
           <w:rFonts w:ascii="Times New Roman" w:cs="Times New Roman" w:eastAsia="Times New Roman" w:hAnsi="Times New Roman"/>
+          <w:b/>
+          <w:bCs/>
           <w:i/>
           <w:iCs/>
           <w:sz w:val="20"/>
@@ -5793,6 +5652,8 @@
       <w:r>
         <w:rPr>
           <w:rFonts w:ascii="Times New Roman" w:cs="Times New Roman" w:eastAsia="Times New Roman" w:hAnsi="Times New Roman"/>
+          <w:b/>
+          <w:bCs/>
           <w:i/>
           <w:iCs/>
           <w:sz w:val="20"/>
@@ -5823,6 +5684,8 @@
       <w:r>
         <w:rPr>
           <w:rFonts w:ascii="Times New Roman" w:cs="Times New Roman" w:eastAsia="Times New Roman" w:hAnsi="Times New Roman"/>
+          <w:b/>
+          <w:bCs/>
           <w:i/>
           <w:iCs/>
           <w:sz w:val="20"/>
@@ -5853,6 +5716,8 @@
       <w:r>
         <w:rPr>
           <w:rFonts w:ascii="Times New Roman" w:cs="Times New Roman" w:eastAsia="Times New Roman" w:hAnsi="Times New Roman"/>
+          <w:b/>
+          <w:bCs/>
           <w:i/>
           <w:iCs/>
           <w:sz w:val="20"/>
@@ -5899,130 +5764,133 @@
       <w:r>
         <w:rPr>
           <w:rFonts w:ascii="Times New Roman" w:cs="Times New Roman" w:eastAsia="Times New Roman" w:hAnsi="Times New Roman"/>
+          <w:b/>
+          <w:bCs/>
+          <w:sz w:val="20"/>
+          <w:szCs w:val="20"/>
+        </w:rPr>
+        <w:t xml:space="preserve">VI. Discussion and Limitations</w:t>
+      </w:r>
+    </w:p>
+    <w:p>
+      <w:pPr>
+        <w:spacing w:after="0" w:line="220"/>
+        <w:ind w:firstLine="288"/>
+        <w:jc w:val="both"/>
+      </w:pPr>
+      <w:r>
+        <w:rPr>
+          <w:rFonts w:ascii="Times New Roman" w:cs="Times New Roman" w:eastAsia="Times New Roman" w:hAnsi="Times New Roman"/>
+          <w:sz w:val="20"/>
+          <w:szCs w:val="20"/>
+        </w:rPr>
+        <w:t xml:space="preserve">Our results support a narrower claim than the cascade literature typically makes. Cascading is not uniformly green; it is green under a stated condition that practitioners can now measure. Reporting that condition requires charging for discarded computation, and doing so changes reported outcomes materially, including reversing the sign of the conclusion in an identifiable regime.</w:t>
+      </w:r>
+    </w:p>
+    <w:p>
+      <w:pPr>
+        <w:spacing w:after="0" w:line="220"/>
+        <w:ind w:firstLine="288"/>
+        <w:jc w:val="both"/>
+      </w:pPr>
+      <w:r>
+        <w:rPr>
+          <w:rFonts w:ascii="Times New Roman" w:cs="Times New Roman" w:eastAsia="Times New Roman" w:hAnsi="Times New Roman"/>
+          <w:sz w:val="20"/>
+          <w:szCs w:val="20"/>
+        </w:rPr>
+        <w:t xml:space="preserve">The practical guidance that follows is threefold. Practitioners should measure their inter-tier energy ratio before adopting a cascade, since it bounds attainable savings; should monitor escalation rate against the break-even condition rather than assuming a fixed threshold remains beneficial as traffic shifts; and should verify that their small tier clears a capability threshold on their own workload, because below it the cascade is a pure loss. Our implementation exposes all three quantities at runtime, which is the practical form the contribution takes.</w:t>
+      </w:r>
+    </w:p>
+    <w:p>
+      <w:pPr>
+        <w:spacing w:after="0" w:line="220"/>
+        <w:ind w:firstLine="288"/>
+        <w:jc w:val="both"/>
+      </w:pPr>
+      <w:r>
+        <w:rPr>
+          <w:rFonts w:ascii="Times New Roman" w:cs="Times New Roman" w:eastAsia="Times New Roman" w:hAnsi="Times New Roman"/>
+          <w:sz w:val="20"/>
+          <w:szCs w:val="20"/>
+        </w:rPr>
+        <w:t xml:space="preserve">Several limitations bound these findings. All local measurements come from one hardware configuration, so absolute figures, though not the break-even relationship, are hardware-specific. The large tier is a 7B model rather than a frontier-scale one, which caps the inter-tier energy ratio and hence achievable savings; a larger tier would raise the ceiling and we expect it to increase reported savings without changing the accounting argument. Judged quality on open-ended text is a model's assessment on an ordinal scale, mitigated but not eliminated by our second judge and human sample. Semantic entropy was evaluated at three samples for cost reasons, which quantises the measure to three values and limits its resolution; a larger sample count may recover discriminative power at proportionally higher energy cost. Finally, NVML captures accelerator power only, excluding host and cooling overheads beyond the fixed PUE factor, so our absolute figures understate total facility energy.</w:t>
+      </w:r>
+    </w:p>
+    <w:p>
+      <w:pPr>
+        <w:spacing w:after="100" w:before="200"/>
+        <w:jc w:val="center"/>
+      </w:pPr>
+      <w:r>
+        <w:rPr>
+          <w:rFonts w:ascii="Times New Roman" w:cs="Times New Roman" w:eastAsia="Times New Roman" w:hAnsi="Times New Roman"/>
+          <w:b/>
+          <w:bCs/>
+          <w:sz w:val="20"/>
+          <w:szCs w:val="20"/>
+        </w:rPr>
+        <w:t xml:space="preserve">VII. Future Work</w:t>
+      </w:r>
+    </w:p>
+    <w:p>
+      <w:pPr>
+        <w:spacing w:after="0" w:line="220"/>
+        <w:ind w:firstLine="288"/>
+        <w:jc w:val="both"/>
+      </w:pPr>
+      <w:r>
+        <w:rPr>
+          <w:rFonts w:ascii="Times New Roman" w:cs="Times New Roman" w:eastAsia="Times New Roman" w:hAnsi="Times New Roman"/>
+          <w:sz w:val="20"/>
+          <w:szCs w:val="20"/>
+        </w:rPr>
+        <w:t xml:space="preserve">Three directions follow. Since neither token entropy nor three-sample semantic entropy discriminates answer quality on open-ended generation at small scale, while both are informative on constrained tasks, locating the capability threshold at which self-assessment becomes reliable on free-form text is the most valuable next step, and the model-zoo methodology used here provides the instrument. Repeating the primary experiment with a frontier-scale large tier would raise the inter-tier energy ratio by an order of magnitude and test whether the break-even relationship holds at that scale. Finally, extending measurement to additional hardware generations would convert our single-configuration hardware-dependence observation into a characterised relationship, which practitioners deciding between local and hosted deployment would be able to consult directly.</w:t>
+      </w:r>
+    </w:p>
+    <w:p>
+      <w:pPr>
+        <w:spacing w:after="100" w:before="200"/>
+        <w:jc w:val="center"/>
+      </w:pPr>
+      <w:r>
+        <w:rPr>
+          <w:rFonts w:ascii="Times New Roman" w:cs="Times New Roman" w:eastAsia="Times New Roman" w:hAnsi="Times New Roman"/>
+          <w:b/>
+          <w:bCs/>
+          <w:sz w:val="20"/>
+          <w:szCs w:val="20"/>
+        </w:rPr>
+        <w:t xml:space="preserve">VIII. Conclusion</w:t>
+      </w:r>
+    </w:p>
+    <w:p>
+      <w:pPr>
+        <w:spacing w:after="0" w:line="220"/>
+        <w:ind w:firstLine="288"/>
+        <w:jc w:val="both"/>
+      </w:pPr>
+      <w:r>
+        <w:rPr>
+          <w:rFonts w:ascii="Times New Roman" w:cs="Times New Roman" w:eastAsia="Times New Roman" w:hAnsi="Times New Roman"/>
+          <w:sz w:val="20"/>
+          <w:szCs w:val="20"/>
+        </w:rPr>
+        <w:t xml:space="preserve">We showed that the accounting convention used to evaluate model cascades materially overstates their carbon savings, and that correcting it exposes a break-even condition beyond which cascading increases emissions. Under honest accounting and physically measured energy, confidence-aware cascading still delivers 37.5 percent carbon reduction at 95.9 percent quality retention on real user traffic, and reduces escalation to 5 percent on a visual workload while exceeding both static tiers' accuracy. We also showed that the routing signal is informative only above a small-model capability threshold, below which cascading is strictly harmful. The system, its raw per-query records and its analysis scripts are publicly available, and the library installs from the Python Package Index.</w:t>
+      </w:r>
+    </w:p>
+    <w:p>
+      <w:pPr>
+        <w:spacing w:after="100" w:before="200"/>
+        <w:jc w:val="center"/>
+      </w:pPr>
+      <w:r>
+        <w:rPr>
+          <w:rFonts w:ascii="Times New Roman" w:cs="Times New Roman" w:eastAsia="Times New Roman" w:hAnsi="Times New Roman"/>
           <w:caps/>
           <w:sz w:val="20"/>
           <w:szCs w:val="20"/>
         </w:rPr>
-        <w:t xml:space="preserve">VI. Discussion and Limitations</w:t>
-      </w:r>
-    </w:p>
-    <w:p>
-      <w:pPr>
-        <w:spacing w:after="0" w:line="220"/>
-        <w:ind w:firstLine="288"/>
-        <w:jc w:val="both"/>
-      </w:pPr>
-      <w:r>
-        <w:rPr>
-          <w:rFonts w:ascii="Times New Roman" w:cs="Times New Roman" w:eastAsia="Times New Roman" w:hAnsi="Times New Roman"/>
-          <w:sz w:val="20"/>
-          <w:szCs w:val="20"/>
-        </w:rPr>
-        <w:t xml:space="preserve">Our results support a narrower claim than the cascade literature typically makes. Cascading is not uniformly green; it is green under a stated condition that practitioners can now measure. Reporting that condition requires charging for discarded computation, and doing so changes reported outcomes materially, including reversing the sign of the conclusion in an identifiable regime.</w:t>
-      </w:r>
-    </w:p>
-    <w:p>
-      <w:pPr>
-        <w:spacing w:after="0" w:line="220"/>
-        <w:ind w:firstLine="288"/>
-        <w:jc w:val="both"/>
-      </w:pPr>
-      <w:r>
-        <w:rPr>
-          <w:rFonts w:ascii="Times New Roman" w:cs="Times New Roman" w:eastAsia="Times New Roman" w:hAnsi="Times New Roman"/>
-          <w:sz w:val="20"/>
-          <w:szCs w:val="20"/>
-        </w:rPr>
-        <w:t xml:space="preserve">The practical guidance that follows is threefold. Practitioners should measure their inter-tier energy ratio before adopting a cascade, since it bounds attainable savings; should monitor escalation rate against the break-even condition rather than assuming a fixed threshold remains beneficial as traffic shifts; and should verify that their small tier clears a capability threshold on their own workload, because below it the cascade is a pure loss. Our implementation exposes all three quantities at runtime, which is the practical form the contribution takes.</w:t>
-      </w:r>
-    </w:p>
-    <w:p>
-      <w:pPr>
-        <w:spacing w:after="0" w:line="220"/>
-        <w:ind w:firstLine="288"/>
-        <w:jc w:val="both"/>
-      </w:pPr>
-      <w:r>
-        <w:rPr>
-          <w:rFonts w:ascii="Times New Roman" w:cs="Times New Roman" w:eastAsia="Times New Roman" w:hAnsi="Times New Roman"/>
-          <w:sz w:val="20"/>
-          <w:szCs w:val="20"/>
-        </w:rPr>
-        <w:t xml:space="preserve">Several limitations bound these findings. All local measurements come from one hardware configuration, so absolute figures, though not the break-even relationship, are hardware-specific. The large tier is a 7B model rather than a frontier-scale one, which caps the inter-tier energy ratio and hence achievable savings; a larger tier would raise the ceiling and we expect it to increase reported savings without changing the accounting argument. Judged quality on open-ended text is a model's assessment on an ordinal scale, mitigated but not eliminated by our second judge and human sample. Semantic entropy was evaluated at three samples for cost reasons, which quantises the measure to three values and limits its resolution; a larger sample count may recover discriminative power at proportionally higher energy cost. Finally, NVML captures accelerator power only, excluding host and cooling overheads beyond the fixed PUE factor, so our absolute figures understate total facility energy.</w:t>
-      </w:r>
-    </w:p>
-    <w:p>
-      <w:pPr>
-        <w:spacing w:after="100" w:before="200"/>
-        <w:jc w:val="center"/>
-      </w:pPr>
-      <w:r>
-        <w:rPr>
-          <w:rFonts w:ascii="Times New Roman" w:cs="Times New Roman" w:eastAsia="Times New Roman" w:hAnsi="Times New Roman"/>
-          <w:caps/>
-          <w:sz w:val="20"/>
-          <w:szCs w:val="20"/>
-        </w:rPr>
-        <w:t xml:space="preserve">VII. Future Work</w:t>
-      </w:r>
-    </w:p>
-    <w:p>
-      <w:pPr>
-        <w:spacing w:after="0" w:line="220"/>
-        <w:ind w:firstLine="288"/>
-        <w:jc w:val="both"/>
-      </w:pPr>
-      <w:r>
-        <w:rPr>
-          <w:rFonts w:ascii="Times New Roman" w:cs="Times New Roman" w:eastAsia="Times New Roman" w:hAnsi="Times New Roman"/>
-          <w:sz w:val="20"/>
-          <w:szCs w:val="20"/>
-        </w:rPr>
-        <w:t xml:space="preserve">Three directions follow. Since neither token entropy nor three-sample semantic entropy discriminates answer quality on open-ended generation at small scale, while both are informative on constrained tasks, locating the capability threshold at which self-assessment becomes reliable on free-form text is the most valuable next step, and the model-zoo methodology used here provides the instrument. Repeating the primary experiment with a frontier-scale large tier would raise the inter-tier energy ratio by an order of magnitude and test whether the break-even relationship holds at that scale. Finally, extending measurement to additional hardware generations would convert our single-configuration hardware-dependence observation into a characterised relationship, which practitioners deciding between local and hosted deployment would be able to consult directly.</w:t>
-      </w:r>
-    </w:p>
-    <w:p>
-      <w:pPr>
-        <w:spacing w:after="100" w:before="200"/>
-        <w:jc w:val="center"/>
-      </w:pPr>
-      <w:r>
-        <w:rPr>
-          <w:rFonts w:ascii="Times New Roman" w:cs="Times New Roman" w:eastAsia="Times New Roman" w:hAnsi="Times New Roman"/>
-          <w:caps/>
-          <w:sz w:val="20"/>
-          <w:szCs w:val="20"/>
-        </w:rPr>
-        <w:t xml:space="preserve">VIII. Conclusion</w:t>
-      </w:r>
-    </w:p>
-    <w:p>
-      <w:pPr>
-        <w:spacing w:after="0" w:line="220"/>
-        <w:ind w:firstLine="288"/>
-        <w:jc w:val="both"/>
-      </w:pPr>
-      <w:r>
-        <w:rPr>
-          <w:rFonts w:ascii="Times New Roman" w:cs="Times New Roman" w:eastAsia="Times New Roman" w:hAnsi="Times New Roman"/>
-          <w:sz w:val="20"/>
-          <w:szCs w:val="20"/>
-        </w:rPr>
-        <w:t xml:space="preserve">We showed that the accounting convention used to evaluate model cascades materially overstates their carbon savings, and that correcting it exposes a break-even condition beyond which cascading increases emissions. Under honest accounting and physically measured energy, confidence-aware cascading still delivers 37.5 percent carbon reduction at 95.9 percent quality retention on real user traffic, and reduces escalation to 5 percent on a visual workload while exceeding both static tiers' accuracy. We also showed that the routing signal is informative only above a small-model capability threshold, below which cascading is strictly harmful. The system, its raw per-query records and its analysis scripts are publicly available, and the library installs from the Python Package Index.</w:t>
-      </w:r>
-    </w:p>
-    <w:p>
-      <w:pPr>
-        <w:spacing w:after="100" w:before="200"/>
-        <w:jc w:val="center"/>
-      </w:pPr>
-      <w:r>
-        <w:rPr>
-          <w:rFonts w:ascii="Times New Roman" w:cs="Times New Roman" w:eastAsia="Times New Roman" w:hAnsi="Times New Roman"/>
-          <w:caps/>
-          <w:sz w:val="20"/>
-          <w:szCs w:val="20"/>
-        </w:rPr>
         <w:t xml:space="preserve">References</w:t>
       </w:r>
     </w:p>
@@ -6179,9 +6047,9 @@
     <w:sectPr>
       <w:type w:val="continuous"/>
       <w:pgSz w:w="11906" w:h="16838" w:orient="portrait"/>
-      <w:pgMar w:top="1000" w:right="1000" w:bottom="1000" w:left="1000" w:header="708" w:footer="708" w:gutter="0"/>
+      <w:pgMar w:top="1080" w:right="900" w:bottom="1440" w:left="900" w:header="708" w:footer="708" w:gutter="0"/>
       <w:pgNumType/>
-      <w:cols w:space="340" w:num="2" w:equalWidth="true"/>
+      <w:cols w:space="288" w:num="2" w:equalWidth="true"/>
       <w:docGrid w:linePitch="360"/>
     </w:sectPr>
   </w:body>

</xml_diff>